<commit_message>
Brief: drop app screenshots, end every video on a waitlist CTA panel
Co-Authored-By: Claude Opus 5.5 <noreply@anthropic.com>
</commit_message>
<xml_diff>
--- a/NightShift Motion Graphics Brief.docx
+++ b/NightShift Motion Graphics Brief.docx
@@ -1272,7 +1272,7 @@
         <w:pStyle w:val="Heading2"/>
       </w:pPr>
       <w:r>
-        <w:t xml:space="preserve">5. Frosted glass and the app on screen</w:t>
+        <w:t xml:space="preserve">5. Frosted glass and the ending</w:t>
       </w:r>
     </w:p>
     <w:p>
@@ -1424,7 +1424,7 @@
         <w:rPr>
           <w:b/>
         </w:rPr>
-        <w:t xml:space="preserve">Showing the app</w:t>
+        <w:t xml:space="preserve">Ending on the waitlist</w:t>
       </w:r>
     </w:p>
     <w:p>
@@ -1436,7 +1436,7 @@
         </w:numPr>
       </w:pPr>
       <w:r>
-        <w:t xml:space="preserve">Use screens from the NightShift mockups canvas, never invented ones. The best moments: "Start wind-down," the wind-down checklist, "I can't sleep," the brain dump and the morning to-do list.</w:t>
+        <w:t xml:space="preserve">Don't show app screens for now. These are explainer videos: show the fix with supers and glass panels, never screenshots or invented UI.</w:t>
       </w:r>
     </w:p>
     <w:p>
@@ -1448,7 +1448,7 @@
         </w:numPr>
       </w:pPr>
       <w:r>
-        <w:t xml:space="preserve">Show the app near the payoff, not the hook, for 3–5 seconds.</w:t>
+        <w:t xml:space="preserve">Every video ends on a waitlist call to action: one last glass panel with a short line (seven words max) and a single pill reading "Join the waitlist."</w:t>
       </w:r>
     </w:p>
     <w:p>
@@ -1460,7 +1460,7 @@
         </w:numPr>
       </w:pPr>
       <w:r>
-        <w:t xml:space="preserve">Float the screen with no device frame, rounded at 120 px, over its own blurred photo. Or let a single panel lift out of the screen and fill the frame.</w:t>
+        <w:t xml:space="preserve">Bring the panel in after the last voiceover line, over the opening photo, and hold it for 3 to 4 seconds. It is the only end card.</w:t>
       </w:r>
     </w:p>
     <w:p>
@@ -1850,10 +1850,10 @@
         <w:rPr>
           <w:b/>
         </w:rPr>
-        <w:t xml:space="preserve">Loops.</w:t>
-      </w:r>
-      <w:r>
-        <w:t xml:space="preserve"> The last frame matches the first: same photo, same framing, same color. The final super fades out on the last word, and the hook fades in on the next play without a jump. Trim any dead air after the last word.</w:t>
+        <w:t xml:space="preserve">Endings.</w:t>
+      </w:r>
+      <w:r>
+        <w:t xml:space="preserve"> Every video ends on the waitlist call-to-action panel (see section 5), not a seamless loop. The final super fades out on the last word, then the panel rises over the opening photo. Trim any dead air after the last word.</w:t>
       </w:r>
     </w:p>
     <w:p>
@@ -1900,7 +1900,7 @@
         </w:numPr>
       </w:pPr>
       <w:r>
-        <w:t xml:space="preserve">Keep supers and app screens out of the top 250 px, the bottom 420 px and the right 140 px, where TikTok, Reels and Shorts place captions, buttons and handles.</w:t>
+        <w:t xml:space="preserve">Keep supers and panels out of the top 250 px, the bottom 420 px and the right 140 px, where TikTok, Reels and Shorts place captions, buttons and handles.</w:t>
       </w:r>
     </w:p>
     <w:p>
@@ -2093,7 +2093,7 @@
           <w:p>
             <w:pPr/>
             <w:r>
-              <w:t xml:space="preserve">Fix and app</w:t>
+              <w:t xml:space="preserve">Fix</w:t>
             </w:r>
           </w:p>
         </w:tc>
@@ -2115,7 +2115,7 @@
           <w:p>
             <w:pPr/>
             <w:r>
-              <w:t xml:space="preserve">The concrete step as a glass panel, then the matching app screen</w:t>
+              <w:t xml:space="preserve">The concrete step as a glass panel</w:t>
             </w:r>
           </w:p>
         </w:tc>
@@ -2128,7 +2128,7 @@
           <w:p>
             <w:pPr/>
             <w:r>
-              <w:t xml:space="preserve">Loop line</w:t>
+              <w:t xml:space="preserve">Call to action</w:t>
             </w:r>
           </w:p>
         </w:tc>
@@ -2150,7 +2150,7 @@
           <w:p>
             <w:pPr/>
             <w:r>
-              <w:t xml:space="preserve">The last super, back on the opening photo and framing</w:t>
+              <w:t xml:space="preserve">The last super, then the waitlist glass panel and pill over the opening photo</w:t>
             </w:r>
           </w:p>
         </w:tc>
@@ -2165,7 +2165,7 @@
         </w:numPr>
       </w:pPr>
       <w:r>
-        <w:t xml:space="preserve">No intro cards, logos up front, "hey guys," or end cards. The waitlist call to action lives in the caption and pinned comment unless we brief otherwise.</w:t>
+        <w:t xml:space="preserve">No intro cards, logos up front, "hey guys," or "follow for more." The only end card is the waitlist call-to-action panel. Also put the waitlist link in the caption and pinned comment.</w:t>
       </w:r>
     </w:p>
     <w:p>
@@ -2388,7 +2388,7 @@
           <w:p>
             <w:pPr/>
             <w:r>
-              <w:t xml:space="preserve">Real NightShift screens</w:t>
+              <w:t xml:space="preserve">Supers and glass panels for the fix</w:t>
             </w:r>
           </w:p>
         </w:tc>
@@ -2399,7 +2399,7 @@
           <w:p>
             <w:pPr/>
             <w:r>
-              <w:t xml:space="preserve">Invented UI, sleep scores, rings or percentages</w:t>
+              <w:t xml:space="preserve">App screenshots (for now), invented UI, sleep scores, rings or percentages</w:t>
             </w:r>
           </w:p>
         </w:tc>
@@ -2460,7 +2460,7 @@
           <w:p>
             <w:pPr/>
             <w:r>
-              <w:t xml:space="preserve">Matching first and last frames</w:t>
+              <w:t xml:space="preserve">Ending on the waitlist panel</w:t>
             </w:r>
           </w:p>
         </w:tc>
@@ -2471,7 +2471,7 @@
           <w:p>
             <w:pPr/>
             <w:r>
-              <w:t xml:space="preserve">End cards, logo stings or "follow for more"</w:t>
+              <w:t xml:space="preserve">Logo stings or "follow for more"</w:t>
             </w:r>
           </w:p>
         </w:tc>
@@ -2888,7 +2888,7 @@
           <w:p>
             <w:pPr/>
             <w:r>
-              <w:t xml:space="preserve">Glass panel rises with three steps, then dissolves into the app's "Can't sleep" screen; soft tap on "I can't sleep"</w:t>
+              <w:t xml:space="preserve">Glass panel rises with three steps, one row at a time</w:t>
             </w:r>
           </w:p>
         </w:tc>
@@ -2940,7 +2940,7 @@
           <w:p>
             <w:pPr/>
             <w:r>
-              <w:t xml:space="preserve">Crossfade back to the opening moon framing; last word fades into the loop</w:t>
+              <w:t xml:space="preserve">Crossfade back to the opening moon framing; the super fades out, then the waitlist panel rises with its "Join the waitlist" pill and a soft tap</w:t>
             </w:r>
           </w:p>
         </w:tc>
@@ -3006,7 +3006,7 @@
         </w:r>
       </w:hyperlink>
       <w:r>
-        <w:t xml:space="preserve">: every app screen to use in videos.</w:t>
+        <w:t xml:space="preserve">: for reference only. Don't use app screens in videos for now.</w:t>
       </w:r>
     </w:p>
     <w:p>
@@ -3162,7 +3162,7 @@
         </w:numPr>
       </w:pPr>
       <w:r>
-        <w:t xml:space="preserve">☐ Where does the waitlist call to action go: caption only, or a final glass panel?</w:t>
+        <w:t xml:space="preserve">☑ Decided: the waitlist call to action is a final glass panel with a pill, plus the link in the caption and pinned comment.</w:t>
       </w:r>
     </w:p>
     <w:p>

</xml_diff>